<commit_message>
some chages are to be made
</commit_message>
<xml_diff>
--- a/सिमस म्यानुअल.docx
+++ b/सिमस म्यानुअल.docx
@@ -60,8 +60,6 @@
         </w:rPr>
         <w:t xml:space="preserve"> Operation Manual</w:t>
       </w:r>
-      <w:bookmarkStart w:id="0" w:name="_GoBack"/>
-      <w:bookmarkEnd w:id="0"/>
     </w:p>
     <w:p>
       <w:pPr>
@@ -117,7 +115,6 @@
         <w:pStyle w:val="ListParagraph"/>
         <w:jc w:val="both"/>
         <w:rPr>
-          <w:rFonts w:hint="cs"/>
           <w:sz w:val="24"/>
           <w:szCs w:val="24"/>
         </w:rPr>
@@ -361,7 +358,6 @@
         <w:pStyle w:val="ListParagraph"/>
         <w:jc w:val="both"/>
         <w:rPr>
-          <w:rFonts w:hint="cs"/>
           <w:sz w:val="24"/>
           <w:szCs w:val="24"/>
         </w:rPr>
@@ -419,7 +415,6 @@
         </w:numPr>
         <w:jc w:val="both"/>
         <w:rPr>
-          <w:rFonts w:hint="cs"/>
           <w:sz w:val="24"/>
           <w:szCs w:val="24"/>
         </w:rPr>
@@ -494,7 +489,6 @@
         </w:numPr>
         <w:jc w:val="both"/>
         <w:rPr>
-          <w:rFonts w:hint="cs"/>
           <w:sz w:val="24"/>
           <w:szCs w:val="24"/>
         </w:rPr>
@@ -586,7 +580,6 @@
         </w:numPr>
         <w:jc w:val="both"/>
         <w:rPr>
-          <w:rFonts w:hint="cs"/>
           <w:sz w:val="24"/>
           <w:szCs w:val="24"/>
         </w:rPr>
@@ -661,7 +654,6 @@
         </w:numPr>
         <w:jc w:val="both"/>
         <w:rPr>
-          <w:rFonts w:hint="cs"/>
           <w:sz w:val="24"/>
           <w:szCs w:val="24"/>
         </w:rPr>
@@ -891,7 +883,6 @@
         <w:pStyle w:val="ListParagraph"/>
         <w:jc w:val="both"/>
         <w:rPr>
-          <w:rFonts w:hint="cs"/>
           <w:sz w:val="24"/>
           <w:szCs w:val="24"/>
         </w:rPr>
@@ -1040,7 +1031,6 @@
         </w:numPr>
         <w:jc w:val="both"/>
         <w:rPr>
-          <w:rFonts w:hint="cs"/>
           <w:sz w:val="24"/>
           <w:szCs w:val="24"/>
         </w:rPr>
@@ -1163,7 +1153,6 @@
         <w:pStyle w:val="ListParagraph"/>
         <w:jc w:val="both"/>
         <w:rPr>
-          <w:rFonts w:hint="cs"/>
           <w:sz w:val="24"/>
           <w:szCs w:val="24"/>
         </w:rPr>
@@ -1419,7 +1408,6 @@
         <w:pStyle w:val="ListParagraph"/>
         <w:jc w:val="both"/>
         <w:rPr>
-          <w:rFonts w:hint="cs"/>
           <w:sz w:val="24"/>
           <w:szCs w:val="24"/>
         </w:rPr>
@@ -1542,7 +1530,6 @@
         </w:numPr>
         <w:jc w:val="both"/>
         <w:rPr>
-          <w:rFonts w:hint="cs"/>
           <w:sz w:val="24"/>
           <w:szCs w:val="24"/>
         </w:rPr>
@@ -1624,7 +1611,6 @@
         <w:pStyle w:val="ListParagraph"/>
         <w:jc w:val="both"/>
         <w:rPr>
-          <w:rFonts w:hint="cs"/>
           <w:sz w:val="24"/>
           <w:szCs w:val="24"/>
         </w:rPr>
@@ -1802,7 +1788,6 @@
         <w:pStyle w:val="ListParagraph"/>
         <w:jc w:val="both"/>
         <w:rPr>
-          <w:rFonts w:hint="cs"/>
           <w:b/>
           <w:bCs/>
           <w:sz w:val="24"/>
@@ -2015,7 +2000,6 @@
         <w:ind w:left="1440"/>
         <w:jc w:val="both"/>
         <w:rPr>
-          <w:rFonts w:hint="cs"/>
           <w:sz w:val="24"/>
           <w:szCs w:val="24"/>
         </w:rPr>
@@ -2053,7 +2037,6 @@
         <w:pStyle w:val="ListParagraph"/>
         <w:jc w:val="both"/>
         <w:rPr>
-          <w:rFonts w:hint="cs"/>
           <w:sz w:val="24"/>
           <w:szCs w:val="24"/>
         </w:rPr>
@@ -2444,7 +2427,6 @@
         </w:numPr>
         <w:jc w:val="both"/>
         <w:rPr>
-          <w:rFonts w:hint="cs"/>
           <w:sz w:val="24"/>
           <w:szCs w:val="24"/>
         </w:rPr>
@@ -2570,7 +2552,6 @@
         </w:numPr>
         <w:jc w:val="both"/>
         <w:rPr>
-          <w:rFonts w:hint="cs"/>
           <w:sz w:val="24"/>
           <w:szCs w:val="24"/>
         </w:rPr>
@@ -2649,7 +2630,6 @@
         <w:ind w:left="1440"/>
         <w:jc w:val="both"/>
         <w:rPr>
-          <w:rFonts w:hint="cs"/>
           <w:sz w:val="24"/>
           <w:szCs w:val="24"/>
         </w:rPr>
@@ -2697,7 +2677,6 @@
         <w:pStyle w:val="ListParagraph"/>
         <w:jc w:val="both"/>
         <w:rPr>
-          <w:rFonts w:hint="cs"/>
           <w:sz w:val="24"/>
           <w:szCs w:val="24"/>
           <w:cs/>
@@ -2752,7 +2731,6 @@
         <w:pStyle w:val="ListParagraph"/>
         <w:jc w:val="both"/>
         <w:rPr>
-          <w:rFonts w:hint="cs"/>
           <w:b/>
           <w:bCs/>
           <w:sz w:val="24"/>
@@ -2832,7 +2810,6 @@
         </w:numPr>
         <w:jc w:val="both"/>
         <w:rPr>
-          <w:rFonts w:hint="cs"/>
           <w:b/>
           <w:bCs/>
           <w:sz w:val="24"/>
@@ -2893,7 +2870,6 @@
         </w:numPr>
         <w:jc w:val="both"/>
         <w:rPr>
-          <w:rFonts w:hint="cs"/>
           <w:sz w:val="24"/>
           <w:szCs w:val="24"/>
         </w:rPr>
@@ -3002,7 +2978,6 @@
         </w:numPr>
         <w:jc w:val="both"/>
         <w:rPr>
-          <w:rFonts w:hint="cs"/>
           <w:b/>
           <w:bCs/>
           <w:sz w:val="24"/>
@@ -3146,7 +3121,6 @@
         </w:numPr>
         <w:jc w:val="both"/>
         <w:rPr>
-          <w:rFonts w:hint="cs"/>
           <w:sz w:val="24"/>
           <w:szCs w:val="24"/>
         </w:rPr>
@@ -3249,7 +3223,6 @@
       <w:pPr>
         <w:jc w:val="both"/>
         <w:rPr>
-          <w:rFonts w:hint="cs"/>
           <w:sz w:val="24"/>
           <w:szCs w:val="24"/>
         </w:rPr>
@@ -3261,7 +3234,6 @@
         <w:ind w:left="1440"/>
         <w:jc w:val="both"/>
         <w:rPr>
-          <w:rFonts w:hint="cs"/>
           <w:sz w:val="24"/>
           <w:szCs w:val="24"/>
         </w:rPr>
@@ -3309,7 +3281,6 @@
         <w:pStyle w:val="ListParagraph"/>
         <w:jc w:val="both"/>
         <w:rPr>
-          <w:rFonts w:hint="cs"/>
           <w:sz w:val="24"/>
           <w:szCs w:val="24"/>
         </w:rPr>
@@ -3438,7 +3409,6 @@
         <w:pStyle w:val="ListParagraph"/>
         <w:jc w:val="both"/>
         <w:rPr>
-          <w:rFonts w:hint="cs"/>
           <w:b/>
           <w:bCs/>
           <w:sz w:val="24"/>
@@ -3487,7 +3457,6 @@
         </w:numPr>
         <w:jc w:val="both"/>
         <w:rPr>
-          <w:rFonts w:hint="cs"/>
           <w:b/>
           <w:bCs/>
           <w:sz w:val="24"/>
@@ -3556,7 +3525,6 @@
         </w:numPr>
         <w:jc w:val="both"/>
         <w:rPr>
-          <w:rFonts w:hint="cs"/>
           <w:sz w:val="24"/>
           <w:szCs w:val="24"/>
         </w:rPr>
@@ -3656,7 +3624,6 @@
         </w:numPr>
         <w:jc w:val="both"/>
         <w:rPr>
-          <w:rFonts w:hint="cs"/>
           <w:b/>
           <w:bCs/>
           <w:sz w:val="24"/>
@@ -3800,7 +3767,6 @@
         </w:numPr>
         <w:jc w:val="both"/>
         <w:rPr>
-          <w:rFonts w:hint="cs"/>
           <w:sz w:val="24"/>
           <w:szCs w:val="24"/>
         </w:rPr>
@@ -3888,7 +3854,6 @@
         <w:pStyle w:val="ListParagraph"/>
         <w:jc w:val="both"/>
         <w:rPr>
-          <w:rFonts w:hint="cs"/>
           <w:sz w:val="24"/>
           <w:szCs w:val="24"/>
         </w:rPr>
@@ -3934,7 +3899,6 @@
         <w:pStyle w:val="ListParagraph"/>
         <w:jc w:val="both"/>
         <w:rPr>
-          <w:rFonts w:hint="cs"/>
           <w:sz w:val="24"/>
           <w:szCs w:val="24"/>
         </w:rPr>
@@ -4046,7 +4010,6 @@
         <w:pStyle w:val="ListParagraph"/>
         <w:jc w:val="both"/>
         <w:rPr>
-          <w:rFonts w:hint="cs"/>
           <w:b/>
           <w:bCs/>
           <w:sz w:val="24"/>
@@ -4253,7 +4216,6 @@
         </w:numPr>
         <w:jc w:val="both"/>
         <w:rPr>
-          <w:rFonts w:hint="cs"/>
           <w:sz w:val="24"/>
           <w:szCs w:val="24"/>
         </w:rPr>
@@ -4324,15 +4286,7 @@
           <w:szCs w:val="24"/>
           <w:cs/>
         </w:rPr>
-        <w:t xml:space="preserve"> आदेशहरू</w:t>
-      </w:r>
-      <w:r>
-        <w:rPr>
-          <w:sz w:val="24"/>
-          <w:szCs w:val="24"/>
-          <w:cs/>
-        </w:rPr>
-        <w:t xml:space="preserve"> टेवलमा देख्न सकिन्छ </w:t>
+        <w:t xml:space="preserve"> आदेशहरू टेवलमा देख्न सकिन्छ </w:t>
       </w:r>
       <w:r>
         <w:rPr>
@@ -4353,7 +4307,6 @@
         </w:numPr>
         <w:jc w:val="both"/>
         <w:rPr>
-          <w:rFonts w:hint="cs"/>
           <w:sz w:val="24"/>
           <w:szCs w:val="24"/>
         </w:rPr>
@@ -4391,15 +4344,7 @@
           <w:szCs w:val="24"/>
           <w:cs/>
         </w:rPr>
-        <w:t xml:space="preserve"> आदेश</w:t>
-      </w:r>
-      <w:r>
-        <w:rPr>
-          <w:sz w:val="24"/>
-          <w:szCs w:val="24"/>
-          <w:cs/>
-        </w:rPr>
-        <w:t xml:space="preserve"> भित्र जान आँखा चिन्ह भएको बटन थिच्नु पर्छ </w:t>
+        <w:t xml:space="preserve"> आदेश भित्र जान आँखा चिन्ह भएको बटन थिच्नु पर्छ </w:t>
       </w:r>
       <w:r>
         <w:rPr>
@@ -4420,7 +4365,6 @@
         </w:numPr>
         <w:jc w:val="both"/>
         <w:rPr>
-          <w:rFonts w:hint="cs"/>
           <w:b/>
           <w:bCs/>
           <w:sz w:val="24"/>
@@ -4659,7 +4603,6 @@
         </w:numPr>
         <w:jc w:val="both"/>
         <w:rPr>
-          <w:rFonts w:hint="cs"/>
           <w:b/>
           <w:bCs/>
           <w:sz w:val="24"/>
@@ -5049,7 +4992,6 @@
         </w:numPr>
         <w:jc w:val="both"/>
         <w:rPr>
-          <w:rFonts w:hint="cs"/>
           <w:b/>
           <w:bCs/>
           <w:sz w:val="24"/>
@@ -5256,7 +5198,6 @@
         <w:ind w:left="1440"/>
         <w:jc w:val="both"/>
         <w:rPr>
-          <w:rFonts w:hint="cs"/>
           <w:b/>
           <w:bCs/>
           <w:sz w:val="24"/>
@@ -5273,7 +5214,6 @@
         </w:numPr>
         <w:jc w:val="both"/>
         <w:rPr>
-          <w:rFonts w:hint="cs"/>
           <w:b/>
           <w:bCs/>
           <w:sz w:val="24"/>
@@ -5308,7 +5248,6 @@
         <w:pStyle w:val="ListParagraph"/>
         <w:jc w:val="both"/>
         <w:rPr>
-          <w:rFonts w:hint="cs"/>
           <w:sz w:val="24"/>
           <w:szCs w:val="24"/>
         </w:rPr>
@@ -5552,7 +5491,6 @@
         </w:numPr>
         <w:jc w:val="both"/>
         <w:rPr>
-          <w:rFonts w:hint="cs"/>
           <w:sz w:val="24"/>
           <w:szCs w:val="24"/>
         </w:rPr>
@@ -5644,7 +5582,6 @@
         </w:numPr>
         <w:jc w:val="both"/>
         <w:rPr>
-          <w:rFonts w:hint="cs"/>
           <w:sz w:val="24"/>
           <w:szCs w:val="24"/>
         </w:rPr>
@@ -5793,7 +5730,6 @@
         </w:numPr>
         <w:jc w:val="both"/>
         <w:rPr>
-          <w:rFonts w:hint="cs"/>
           <w:sz w:val="24"/>
           <w:szCs w:val="24"/>
         </w:rPr>
@@ -5989,7 +5925,6 @@
         </w:numPr>
         <w:jc w:val="both"/>
         <w:rPr>
-          <w:rFonts w:hint="cs"/>
           <w:b/>
           <w:bCs/>
           <w:sz w:val="24"/>
@@ -6388,7 +6323,6 @@
         </w:numPr>
         <w:jc w:val="both"/>
         <w:rPr>
-          <w:rFonts w:hint="cs"/>
           <w:b/>
           <w:bCs/>
           <w:sz w:val="24"/>
@@ -6490,7 +6424,6 @@
         </w:numPr>
         <w:jc w:val="both"/>
         <w:rPr>
-          <w:rFonts w:hint="cs"/>
           <w:b/>
           <w:bCs/>
           <w:sz w:val="24"/>
@@ -6729,7 +6662,6 @@
       <w:pPr>
         <w:jc w:val="both"/>
         <w:rPr>
-          <w:rFonts w:hint="cs"/>
           <w:b/>
           <w:bCs/>
           <w:sz w:val="24"/>
@@ -6808,7 +6740,6 @@
         <w:ind w:firstLine="720"/>
         <w:jc w:val="both"/>
         <w:rPr>
-          <w:rFonts w:hint="cs"/>
           <w:sz w:val="24"/>
           <w:szCs w:val="24"/>
         </w:rPr>
@@ -6904,17 +6835,7 @@
           <w:szCs w:val="24"/>
           <w:cs/>
         </w:rPr>
-        <w:t xml:space="preserve"> कसरि तयार गर्ने </w:t>
-      </w:r>
-      <w:r>
-        <w:rPr>
-          <w:b/>
-          <w:bCs/>
-          <w:sz w:val="24"/>
-          <w:szCs w:val="24"/>
-          <w:cs/>
-        </w:rPr>
-        <w:t xml:space="preserve"> </w:t>
+        <w:t xml:space="preserve"> कसरि तयार गर्ने  </w:t>
       </w:r>
       <w:r>
         <w:rPr>
@@ -7078,7 +6999,6 @@
         </w:numPr>
         <w:jc w:val="both"/>
         <w:rPr>
-          <w:rFonts w:hint="cs"/>
           <w:sz w:val="24"/>
           <w:szCs w:val="24"/>
         </w:rPr>
@@ -7170,7 +7090,6 @@
         </w:numPr>
         <w:jc w:val="both"/>
         <w:rPr>
-          <w:rFonts w:hint="cs"/>
           <w:sz w:val="24"/>
           <w:szCs w:val="24"/>
         </w:rPr>
@@ -7225,7 +7144,6 @@
         <w:ind w:left="1080"/>
         <w:jc w:val="both"/>
         <w:rPr>
-          <w:rFonts w:hint="cs"/>
           <w:sz w:val="24"/>
           <w:szCs w:val="24"/>
         </w:rPr>
@@ -7331,7 +7249,6 @@
         </w:numPr>
         <w:jc w:val="both"/>
         <w:rPr>
-          <w:rFonts w:hint="cs"/>
           <w:sz w:val="24"/>
           <w:szCs w:val="24"/>
         </w:rPr>
@@ -7536,7 +7453,6 @@
         </w:numPr>
         <w:jc w:val="both"/>
         <w:rPr>
-          <w:rFonts w:hint="cs"/>
           <w:b/>
           <w:bCs/>
           <w:sz w:val="24"/>
@@ -7943,7 +7859,6 @@
         </w:numPr>
         <w:jc w:val="both"/>
         <w:rPr>
-          <w:rFonts w:hint="cs"/>
           <w:b/>
           <w:bCs/>
           <w:sz w:val="24"/>
@@ -8062,7 +7977,6 @@
         </w:numPr>
         <w:jc w:val="both"/>
         <w:rPr>
-          <w:rFonts w:hint="cs"/>
           <w:b/>
           <w:bCs/>
           <w:sz w:val="24"/>
@@ -8330,7 +8244,6 @@
         </w:numPr>
         <w:jc w:val="both"/>
         <w:rPr>
-          <w:rFonts w:hint="cs"/>
           <w:sz w:val="24"/>
           <w:szCs w:val="24"/>
         </w:rPr>
@@ -8401,15 +8314,7 @@
           <w:szCs w:val="24"/>
           <w:cs/>
         </w:rPr>
-        <w:t xml:space="preserve"> </w:t>
-      </w:r>
-      <w:r>
-        <w:rPr>
-          <w:sz w:val="24"/>
-          <w:szCs w:val="24"/>
-          <w:cs/>
-        </w:rPr>
-        <w:t>सट्टा</w:t>
+        <w:t xml:space="preserve"> सट्टा</w:t>
       </w:r>
       <w:r>
         <w:rPr>
@@ -8752,7 +8657,6 @@
         </w:numPr>
         <w:jc w:val="both"/>
         <w:rPr>
-          <w:rFonts w:hint="cs"/>
           <w:sz w:val="24"/>
           <w:szCs w:val="24"/>
         </w:rPr>
@@ -9065,7 +8969,6 @@
         </w:numPr>
         <w:jc w:val="both"/>
         <w:rPr>
-          <w:rFonts w:hint="cs"/>
           <w:sz w:val="24"/>
           <w:szCs w:val="24"/>
         </w:rPr>
@@ -9271,7 +9174,6 @@
         <w:pStyle w:val="ListParagraph"/>
         <w:jc w:val="both"/>
         <w:rPr>
-          <w:rFonts w:hint="cs"/>
           <w:sz w:val="24"/>
           <w:szCs w:val="24"/>
         </w:rPr>
@@ -9482,7 +9384,6 @@
         </w:numPr>
         <w:jc w:val="both"/>
         <w:rPr>
-          <w:rFonts w:hint="cs"/>
           <w:sz w:val="24"/>
           <w:szCs w:val="24"/>
         </w:rPr>
@@ -9557,7 +9458,6 @@
         </w:numPr>
         <w:jc w:val="both"/>
         <w:rPr>
-          <w:rFonts w:hint="cs"/>
           <w:sz w:val="24"/>
           <w:szCs w:val="24"/>
         </w:rPr>
@@ -9689,7 +9589,6 @@
         </w:numPr>
         <w:jc w:val="both"/>
         <w:rPr>
-          <w:rFonts w:hint="cs"/>
           <w:sz w:val="24"/>
           <w:szCs w:val="24"/>
         </w:rPr>
@@ -9860,7 +9759,6 @@
         </w:numPr>
         <w:jc w:val="both"/>
         <w:rPr>
-          <w:rFonts w:hint="cs"/>
           <w:b/>
           <w:bCs/>
           <w:sz w:val="24"/>
@@ -10266,7 +10164,6 @@
         </w:numPr>
         <w:jc w:val="both"/>
         <w:rPr>
-          <w:rFonts w:hint="cs"/>
           <w:b/>
           <w:bCs/>
           <w:sz w:val="24"/>
@@ -10385,7 +10282,6 @@
         </w:numPr>
         <w:jc w:val="both"/>
         <w:rPr>
-          <w:rFonts w:hint="cs"/>
           <w:b/>
           <w:bCs/>
           <w:sz w:val="24"/>
@@ -10541,7 +10437,6 @@
         <w:ind w:left="1080"/>
         <w:jc w:val="both"/>
         <w:rPr>
-          <w:rFonts w:hint="cs"/>
           <w:b/>
           <w:bCs/>
           <w:sz w:val="24"/>
@@ -10589,7 +10484,6 @@
         <w:pStyle w:val="ListParagraph"/>
         <w:jc w:val="both"/>
         <w:rPr>
-          <w:rFonts w:hint="cs"/>
           <w:sz w:val="24"/>
           <w:szCs w:val="24"/>
         </w:rPr>
@@ -10749,7 +10643,6 @@
         </w:numPr>
         <w:jc w:val="both"/>
         <w:rPr>
-          <w:rFonts w:hint="cs"/>
           <w:sz w:val="24"/>
           <w:szCs w:val="24"/>
           <w:cs/>
@@ -10782,7 +10675,6 @@
         <w:pStyle w:val="ListParagraph"/>
         <w:jc w:val="both"/>
         <w:rPr>
-          <w:rFonts w:hint="cs"/>
           <w:sz w:val="24"/>
           <w:szCs w:val="24"/>
         </w:rPr>
@@ -11008,16 +10900,7 @@
           <w:szCs w:val="24"/>
           <w:cs/>
         </w:rPr>
-        <w:t xml:space="preserve">मनुको </w:t>
-      </w:r>
-      <w:r>
-        <w:rPr>
-          <w:rFonts w:hint="cs"/>
-          <w:sz w:val="24"/>
-          <w:szCs w:val="24"/>
-          <w:cs/>
-        </w:rPr>
-        <w:t>खाताहरुमा</w:t>
+        <w:t>मनुको खाताहरुमा</w:t>
       </w:r>
       <w:r>
         <w:rPr>
@@ -11079,7 +10962,6 @@
         </w:numPr>
         <w:jc w:val="both"/>
         <w:rPr>
-          <w:rFonts w:hint="cs"/>
           <w:sz w:val="24"/>
           <w:szCs w:val="24"/>
         </w:rPr>
@@ -11150,15 +11032,7 @@
           <w:szCs w:val="24"/>
           <w:cs/>
         </w:rPr>
-        <w:t xml:space="preserve"> मिन्हा</w:t>
-      </w:r>
-      <w:r>
-        <w:rPr>
-          <w:sz w:val="24"/>
-          <w:szCs w:val="24"/>
-          <w:cs/>
-        </w:rPr>
-        <w:t xml:space="preserve"> फारामहरू टेवलमा देख्न सकिन्छ </w:t>
+        <w:t xml:space="preserve"> मिन्हा फारामहरू टेवलमा देख्न सकिन्छ </w:t>
       </w:r>
       <w:r>
         <w:rPr>
@@ -11179,7 +11053,6 @@
         </w:numPr>
         <w:jc w:val="both"/>
         <w:rPr>
-          <w:rFonts w:hint="cs"/>
           <w:sz w:val="24"/>
           <w:szCs w:val="24"/>
         </w:rPr>
@@ -11216,15 +11089,7 @@
           <w:szCs w:val="24"/>
           <w:cs/>
         </w:rPr>
-        <w:t xml:space="preserve"> </w:t>
-      </w:r>
-      <w:r>
-        <w:rPr>
-          <w:sz w:val="24"/>
-          <w:szCs w:val="24"/>
-          <w:cs/>
-        </w:rPr>
-        <w:t xml:space="preserve">फाराम भित्र जान आँखा चिन्ह भएको बटन थिच्नु पर्छ </w:t>
+        <w:t xml:space="preserve"> फाराम भित्र जान आँखा चिन्ह भएको बटन थिच्नु पर्छ </w:t>
       </w:r>
       <w:r>
         <w:rPr>
@@ -11336,7 +11201,6 @@
         </w:numPr>
         <w:jc w:val="both"/>
         <w:rPr>
-          <w:rFonts w:hint="cs"/>
           <w:sz w:val="24"/>
           <w:szCs w:val="24"/>
         </w:rPr>
@@ -11507,7 +11371,6 @@
         </w:numPr>
         <w:jc w:val="both"/>
         <w:rPr>
-          <w:rFonts w:hint="cs"/>
           <w:b/>
           <w:bCs/>
           <w:sz w:val="24"/>
@@ -11913,7 +11776,6 @@
         </w:numPr>
         <w:jc w:val="both"/>
         <w:rPr>
-          <w:rFonts w:hint="cs"/>
           <w:b/>
           <w:bCs/>
           <w:sz w:val="24"/>
@@ -12032,7 +11894,6 @@
         </w:numPr>
         <w:jc w:val="both"/>
         <w:rPr>
-          <w:rFonts w:hint="cs"/>
           <w:b/>
           <w:bCs/>
           <w:sz w:val="24"/>
@@ -12188,7 +12049,6 @@
         <w:ind w:left="1080"/>
         <w:jc w:val="both"/>
         <w:rPr>
-          <w:rFonts w:hint="cs"/>
           <w:b/>
           <w:bCs/>
           <w:sz w:val="24"/>
@@ -12205,7 +12065,6 @@
         </w:numPr>
         <w:jc w:val="both"/>
         <w:rPr>
-          <w:rFonts w:hint="cs"/>
           <w:sz w:val="24"/>
           <w:szCs w:val="24"/>
           <w:cs/>
@@ -12249,7 +12108,6 @@
         <w:pStyle w:val="ListParagraph"/>
         <w:jc w:val="both"/>
         <w:rPr>
-          <w:rFonts w:hint="cs"/>
           <w:sz w:val="24"/>
           <w:szCs w:val="24"/>
         </w:rPr>
@@ -12554,7 +12412,6 @@
         </w:numPr>
         <w:jc w:val="both"/>
         <w:rPr>
-          <w:rFonts w:hint="cs"/>
           <w:sz w:val="24"/>
           <w:szCs w:val="24"/>
         </w:rPr>
@@ -12654,7 +12511,6 @@
         </w:numPr>
         <w:jc w:val="both"/>
         <w:rPr>
-          <w:rFonts w:hint="cs"/>
           <w:sz w:val="24"/>
           <w:szCs w:val="24"/>
         </w:rPr>
@@ -12786,7 +12642,6 @@
         </w:numPr>
         <w:jc w:val="both"/>
         <w:rPr>
-          <w:rFonts w:hint="cs"/>
           <w:sz w:val="24"/>
           <w:szCs w:val="24"/>
         </w:rPr>
@@ -12941,7 +12796,6 @@
         </w:numPr>
         <w:jc w:val="both"/>
         <w:rPr>
-          <w:rFonts w:hint="cs"/>
           <w:b/>
           <w:bCs/>
           <w:sz w:val="24"/>
@@ -13601,7 +13455,6 @@
         </w:numPr>
         <w:jc w:val="both"/>
         <w:rPr>
-          <w:rFonts w:hint="cs"/>
           <w:b/>
           <w:bCs/>
           <w:sz w:val="24"/>
@@ -13774,7 +13627,6 @@
         <w:pStyle w:val="ListParagraph"/>
         <w:jc w:val="both"/>
         <w:rPr>
-          <w:rFonts w:hint="cs"/>
           <w:sz w:val="24"/>
           <w:szCs w:val="24"/>
         </w:rPr>
@@ -14136,7 +13988,6 @@
         </w:numPr>
         <w:jc w:val="both"/>
         <w:rPr>
-          <w:rFonts w:hint="cs"/>
           <w:b/>
           <w:bCs/>
           <w:sz w:val="24"/>
@@ -14196,7 +14047,6 @@
         </w:numPr>
         <w:jc w:val="both"/>
         <w:rPr>
-          <w:rFonts w:hint="cs"/>
           <w:b/>
           <w:bCs/>
           <w:sz w:val="24"/>
@@ -14497,6 +14347,19 @@
     </w:p>
     <w:p>
       <w:pPr>
+        <w:ind w:left="1080"/>
+        <w:jc w:val="both"/>
+        <w:rPr>
+          <w:rFonts w:hint="cs"/>
+          <w:b/>
+          <w:bCs/>
+          <w:sz w:val="24"/>
+          <w:szCs w:val="24"/>
+        </w:rPr>
+      </w:pPr>
+    </w:p>
+    <w:p>
+      <w:pPr>
         <w:pStyle w:val="ListParagraph"/>
         <w:numPr>
           <w:ilvl w:val="0"/>
@@ -14602,7 +14465,6 @@
         </w:numPr>
         <w:jc w:val="both"/>
         <w:rPr>
-          <w:rFonts w:hint="cs"/>
           <w:sz w:val="24"/>
           <w:szCs w:val="24"/>
         </w:rPr>
@@ -14677,7 +14539,6 @@
         </w:numPr>
         <w:jc w:val="both"/>
         <w:rPr>
-          <w:rFonts w:hint="cs"/>
           <w:sz w:val="24"/>
           <w:szCs w:val="24"/>
         </w:rPr>
@@ -14818,7 +14679,6 @@
         </w:numPr>
         <w:jc w:val="both"/>
         <w:rPr>
-          <w:rFonts w:hint="cs"/>
           <w:sz w:val="24"/>
           <w:szCs w:val="24"/>
         </w:rPr>
@@ -14893,7 +14753,6 @@
         </w:numPr>
         <w:jc w:val="both"/>
         <w:rPr>
-          <w:rFonts w:hint="cs"/>
           <w:sz w:val="24"/>
           <w:szCs w:val="24"/>
         </w:rPr>
@@ -15009,6 +14868,17 @@
         </w:rPr>
         <w:t>स्य थप्ने |</w:t>
       </w:r>
+    </w:p>
+    <w:p>
+      <w:pPr>
+        <w:ind w:left="1080"/>
+        <w:jc w:val="both"/>
+        <w:rPr>
+          <w:rFonts w:hint="cs"/>
+          <w:sz w:val="24"/>
+          <w:szCs w:val="24"/>
+        </w:rPr>
+      </w:pPr>
     </w:p>
     <w:p>
       <w:pPr>
@@ -15050,7 +14920,6 @@
         <w:pStyle w:val="ListParagraph"/>
         <w:jc w:val="both"/>
         <w:rPr>
-          <w:rFonts w:hint="cs"/>
           <w:sz w:val="24"/>
           <w:szCs w:val="24"/>
         </w:rPr>
@@ -15190,7 +15059,6 @@
         </w:numPr>
         <w:jc w:val="both"/>
         <w:rPr>
-          <w:rFonts w:hint="cs"/>
           <w:sz w:val="24"/>
           <w:szCs w:val="24"/>
         </w:rPr>
@@ -15248,7 +15116,6 @@
         </w:numPr>
         <w:jc w:val="both"/>
         <w:rPr>
-          <w:rFonts w:hint="cs"/>
           <w:sz w:val="24"/>
           <w:szCs w:val="24"/>
         </w:rPr>
@@ -15394,7 +15261,6 @@
         </w:numPr>
         <w:jc w:val="both"/>
         <w:rPr>
-          <w:rFonts w:hint="cs"/>
           <w:sz w:val="24"/>
           <w:szCs w:val="24"/>
         </w:rPr>
@@ -15469,7 +15335,6 @@
         </w:numPr>
         <w:jc w:val="both"/>
         <w:rPr>
-          <w:rFonts w:hint="cs"/>
           <w:sz w:val="24"/>
           <w:szCs w:val="24"/>
         </w:rPr>
@@ -15544,7 +15409,6 @@
         </w:numPr>
         <w:jc w:val="both"/>
         <w:rPr>
-          <w:rFonts w:hint="cs"/>
           <w:sz w:val="24"/>
           <w:szCs w:val="24"/>
         </w:rPr>
@@ -15636,7 +15500,6 @@
         </w:numPr>
         <w:jc w:val="both"/>
         <w:rPr>
-          <w:rFonts w:hint="cs"/>
           <w:sz w:val="24"/>
           <w:szCs w:val="24"/>
         </w:rPr>
@@ -15782,6 +15645,7 @@
           <w:szCs w:val="24"/>
           <w:cs/>
         </w:rPr>
+        <w:lastRenderedPageBreak/>
         <w:t>अव</w:t>
       </w:r>
       <w:r>
@@ -15819,21 +15683,15 @@
         <w:ind w:left="1440"/>
         <w:jc w:val="both"/>
         <w:rPr>
-          <w:sz w:val="24"/>
-          <w:szCs w:val="24"/>
-        </w:rPr>
-      </w:pPr>
-    </w:p>
-    <w:p>
-      <w:pPr>
-        <w:pStyle w:val="ListParagraph"/>
-        <w:ind w:left="1440"/>
-        <w:jc w:val="both"/>
-        <w:rPr>
-          <w:sz w:val="24"/>
-          <w:szCs w:val="24"/>
-        </w:rPr>
-      </w:pPr>
+          <w:rFonts w:hint="cs"/>
+          <w:b/>
+          <w:bCs/>
+          <w:sz w:val="24"/>
+          <w:szCs w:val="24"/>
+        </w:rPr>
+      </w:pPr>
+      <w:bookmarkStart w:id="0" w:name="_GoBack"/>
+      <w:bookmarkEnd w:id="0"/>
     </w:p>
     <w:p>
       <w:pPr>
@@ -15853,15 +15711,1223 @@
       <w:r>
         <w:rPr>
           <w:rFonts w:hint="cs"/>
-          <w:sz w:val="24"/>
-          <w:szCs w:val="24"/>
-          <w:cs/>
-        </w:rPr>
-        <w:lastRenderedPageBreak/>
+          <w:b/>
+          <w:bCs/>
+          <w:sz w:val="24"/>
+          <w:szCs w:val="24"/>
+          <w:cs/>
+        </w:rPr>
+        <w:t xml:space="preserve"> आर्थिक</w:t>
+      </w:r>
+      <w:r>
+        <w:rPr>
+          <w:b/>
+          <w:bCs/>
+          <w:sz w:val="24"/>
+          <w:szCs w:val="24"/>
+          <w:cs/>
+        </w:rPr>
+        <w:t xml:space="preserve"> वर्ष बन्द गरी नयाँ आर्थिक </w:t>
+      </w:r>
+      <w:r>
+        <w:rPr>
+          <w:rFonts w:hint="cs"/>
+          <w:b/>
+          <w:bCs/>
+          <w:sz w:val="24"/>
+          <w:szCs w:val="24"/>
+          <w:cs/>
+        </w:rPr>
+        <w:t>वर्ष</w:t>
+      </w:r>
+      <w:r>
+        <w:rPr>
+          <w:b/>
+          <w:bCs/>
+          <w:sz w:val="24"/>
+          <w:szCs w:val="24"/>
+          <w:cs/>
+        </w:rPr>
+        <w:t xml:space="preserve"> सुरु गर्ने </w:t>
+      </w:r>
+    </w:p>
+    <w:p>
+      <w:pPr>
+        <w:pStyle w:val="ListParagraph"/>
+        <w:jc w:val="both"/>
+        <w:rPr>
+          <w:sz w:val="24"/>
+          <w:szCs w:val="24"/>
+        </w:rPr>
+      </w:pPr>
+      <w:r>
+        <w:rPr>
+          <w:rFonts w:hint="cs"/>
+          <w:sz w:val="24"/>
+          <w:szCs w:val="24"/>
+          <w:cs/>
+        </w:rPr>
+        <w:t>आर्थिक</w:t>
+      </w:r>
+      <w:r>
+        <w:rPr>
+          <w:sz w:val="24"/>
+          <w:szCs w:val="24"/>
+          <w:cs/>
+        </w:rPr>
+        <w:t xml:space="preserve"> वर्ष अन्त्य गरी नयाँ आर्थिक वर्ष सुरु </w:t>
+      </w:r>
+      <w:r>
+        <w:rPr>
+          <w:rFonts w:hint="cs"/>
+          <w:sz w:val="24"/>
+          <w:szCs w:val="24"/>
+          <w:cs/>
+        </w:rPr>
+        <w:t>गर्नु</w:t>
+      </w:r>
+      <w:r>
+        <w:rPr>
+          <w:sz w:val="24"/>
+          <w:szCs w:val="24"/>
+          <w:cs/>
+        </w:rPr>
+        <w:t xml:space="preserve"> पुर्व सम्पूर्ण कारोवार हरूको अन्त्य गरी आवश्यक </w:t>
+      </w:r>
+      <w:r>
+        <w:rPr>
+          <w:rFonts w:hint="cs"/>
+          <w:sz w:val="24"/>
+          <w:szCs w:val="24"/>
+          <w:cs/>
+        </w:rPr>
+        <w:t>सम्पूर्ण</w:t>
+      </w:r>
+      <w:r>
+        <w:rPr>
+          <w:sz w:val="24"/>
+          <w:szCs w:val="24"/>
+          <w:cs/>
+        </w:rPr>
+        <w:t xml:space="preserve"> वार्षिक प्रतिवेदनहरू तयार गरिसकेको हुनुपर्ने छ </w:t>
+      </w:r>
+      <w:r>
+        <w:rPr>
+          <w:rFonts w:hint="cs"/>
+          <w:sz w:val="24"/>
+          <w:szCs w:val="24"/>
+          <w:cs/>
+        </w:rPr>
+        <w:t>| सम्पूर्ण</w:t>
+      </w:r>
+      <w:r>
+        <w:rPr>
+          <w:sz w:val="24"/>
+          <w:szCs w:val="24"/>
+          <w:cs/>
+        </w:rPr>
+        <w:t xml:space="preserve"> विवरण</w:t>
+      </w:r>
+      <w:r>
+        <w:rPr>
+          <w:rFonts w:hint="cs"/>
+          <w:sz w:val="24"/>
+          <w:szCs w:val="24"/>
+          <w:cs/>
+        </w:rPr>
+        <w:t>हरू</w:t>
+      </w:r>
+      <w:r>
+        <w:rPr>
+          <w:sz w:val="24"/>
+          <w:szCs w:val="24"/>
+          <w:cs/>
+        </w:rPr>
+        <w:t xml:space="preserve"> नसकी आर्थिक </w:t>
+      </w:r>
+      <w:r>
+        <w:rPr>
+          <w:rFonts w:hint="cs"/>
+          <w:sz w:val="24"/>
+          <w:szCs w:val="24"/>
+          <w:cs/>
+        </w:rPr>
+        <w:t>वर्ष</w:t>
+      </w:r>
+      <w:r>
+        <w:rPr>
+          <w:sz w:val="24"/>
+          <w:szCs w:val="24"/>
+          <w:cs/>
+        </w:rPr>
+        <w:t xml:space="preserve"> वन्द गरेमा वार्षिक प्रतिवेदन पुन तयार गर्न सकिने छैन तर तयार गरिसकेको भए एक प्रति डाउनलोड गर्न सकिने छ </w:t>
+      </w:r>
+      <w:r>
+        <w:rPr>
+          <w:rFonts w:hint="cs"/>
+          <w:sz w:val="24"/>
+          <w:szCs w:val="24"/>
+          <w:cs/>
+        </w:rPr>
+        <w:t>|</w:t>
+      </w:r>
+    </w:p>
+    <w:p>
+      <w:pPr>
+        <w:pStyle w:val="ListParagraph"/>
+        <w:jc w:val="both"/>
+        <w:rPr>
+          <w:rFonts w:hint="cs"/>
+          <w:sz w:val="24"/>
+          <w:szCs w:val="24"/>
+        </w:rPr>
+      </w:pPr>
+    </w:p>
+    <w:p>
+      <w:pPr>
+        <w:pStyle w:val="ListParagraph"/>
+        <w:numPr>
+          <w:ilvl w:val="0"/>
+          <w:numId w:val="17"/>
+        </w:numPr>
+        <w:jc w:val="both"/>
+        <w:rPr>
+          <w:sz w:val="24"/>
+          <w:szCs w:val="24"/>
+        </w:rPr>
+      </w:pPr>
+      <w:r>
+        <w:rPr>
+          <w:rFonts w:hint="cs"/>
+          <w:sz w:val="24"/>
+          <w:szCs w:val="24"/>
+          <w:cs/>
+        </w:rPr>
+        <w:t>आर्थिक</w:t>
+      </w:r>
+      <w:r>
+        <w:rPr>
+          <w:sz w:val="24"/>
+          <w:szCs w:val="24"/>
+          <w:cs/>
+        </w:rPr>
+        <w:t xml:space="preserve"> वर्षहरू थप्ने तरिका बमोजिम </w:t>
+      </w:r>
+      <w:r>
+        <w:rPr>
+          <w:rFonts w:hint="cs"/>
+          <w:sz w:val="24"/>
+          <w:szCs w:val="24"/>
+          <w:cs/>
+        </w:rPr>
+        <w:t>नयाँ</w:t>
+      </w:r>
+      <w:r>
+        <w:rPr>
+          <w:sz w:val="24"/>
+          <w:szCs w:val="24"/>
+          <w:cs/>
+        </w:rPr>
+        <w:t xml:space="preserve"> आर्थिक वर्ष </w:t>
+      </w:r>
+      <w:r>
+        <w:rPr>
+          <w:rFonts w:hint="cs"/>
+          <w:sz w:val="24"/>
+          <w:szCs w:val="24"/>
+          <w:cs/>
+        </w:rPr>
+        <w:t>थप्ने</w:t>
+      </w:r>
+    </w:p>
+    <w:p>
+      <w:pPr>
+        <w:pStyle w:val="ListParagraph"/>
+        <w:numPr>
+          <w:ilvl w:val="0"/>
+          <w:numId w:val="17"/>
+        </w:numPr>
+        <w:jc w:val="both"/>
+        <w:rPr>
+          <w:sz w:val="24"/>
+          <w:szCs w:val="24"/>
+        </w:rPr>
+      </w:pPr>
+      <w:r>
+        <w:rPr>
+          <w:rFonts w:hint="cs"/>
+          <w:sz w:val="24"/>
+          <w:szCs w:val="24"/>
+          <w:cs/>
+        </w:rPr>
+        <w:t>सक्रिय</w:t>
+      </w:r>
+      <w:r>
+        <w:rPr>
+          <w:sz w:val="24"/>
+          <w:szCs w:val="24"/>
+          <w:cs/>
+        </w:rPr>
+        <w:t xml:space="preserve"> आर्थिक वर्ष छान्ने तरिका बमोजिम भर्खर थपेको नयाँ आयोजना छान्ने</w:t>
+      </w:r>
+    </w:p>
+    <w:p>
+      <w:pPr>
+        <w:pStyle w:val="ListParagraph"/>
+        <w:numPr>
+          <w:ilvl w:val="0"/>
+          <w:numId w:val="17"/>
+        </w:numPr>
+        <w:jc w:val="both"/>
+        <w:rPr>
+          <w:sz w:val="24"/>
+          <w:szCs w:val="24"/>
+        </w:rPr>
+      </w:pPr>
+      <w:r>
+        <w:rPr>
+          <w:rFonts w:hint="cs"/>
+          <w:sz w:val="24"/>
+          <w:szCs w:val="24"/>
+          <w:cs/>
+        </w:rPr>
+        <w:t>फेरी</w:t>
+      </w:r>
+      <w:r>
+        <w:rPr>
+          <w:sz w:val="24"/>
+          <w:szCs w:val="24"/>
+          <w:cs/>
+        </w:rPr>
+        <w:t xml:space="preserve"> आर्थीक वर्ष</w:t>
+      </w:r>
+      <w:r>
+        <w:rPr>
+          <w:rFonts w:hint="cs"/>
+          <w:sz w:val="24"/>
+          <w:szCs w:val="24"/>
+          <w:cs/>
+        </w:rPr>
+        <w:t>हरूको</w:t>
+      </w:r>
+      <w:r>
+        <w:rPr>
+          <w:sz w:val="24"/>
+          <w:szCs w:val="24"/>
+          <w:cs/>
+        </w:rPr>
+        <w:t xml:space="preserve"> पेजमा जाने र दायाँ माथि रहेको </w:t>
+      </w:r>
+      <w:r>
+        <w:rPr>
+          <w:color w:val="FF0000"/>
+          <w:sz w:val="24"/>
+          <w:szCs w:val="24"/>
+          <w:cs/>
+        </w:rPr>
+        <w:t>आ.व.</w:t>
+      </w:r>
+      <w:r>
+        <w:rPr>
+          <w:rFonts w:hint="cs"/>
+          <w:color w:val="FF0000"/>
+          <w:sz w:val="24"/>
+          <w:szCs w:val="24"/>
+          <w:cs/>
+        </w:rPr>
+        <w:t xml:space="preserve"> बन्द</w:t>
+      </w:r>
+      <w:r>
+        <w:rPr>
+          <w:color w:val="FF0000"/>
+          <w:sz w:val="24"/>
+          <w:szCs w:val="24"/>
+          <w:cs/>
+        </w:rPr>
+        <w:t xml:space="preserve"> गर्ने </w:t>
+      </w:r>
+      <w:r>
+        <w:rPr>
+          <w:rFonts w:hint="cs"/>
+          <w:sz w:val="24"/>
+          <w:szCs w:val="24"/>
+          <w:cs/>
+        </w:rPr>
+        <w:t>भनि</w:t>
+      </w:r>
+      <w:r>
+        <w:rPr>
+          <w:sz w:val="24"/>
+          <w:szCs w:val="24"/>
+          <w:cs/>
+        </w:rPr>
+        <w:t xml:space="preserve"> लेखिएको बटन थिच्ने </w:t>
+      </w:r>
+      <w:r>
+        <w:rPr>
+          <w:rFonts w:hint="cs"/>
+          <w:sz w:val="24"/>
+          <w:szCs w:val="24"/>
+          <w:cs/>
+        </w:rPr>
+        <w:t>|</w:t>
+      </w:r>
+    </w:p>
+    <w:p>
+      <w:pPr>
+        <w:pStyle w:val="ListParagraph"/>
+        <w:numPr>
+          <w:ilvl w:val="0"/>
+          <w:numId w:val="17"/>
+        </w:numPr>
+        <w:jc w:val="both"/>
+        <w:rPr>
+          <w:sz w:val="24"/>
+          <w:szCs w:val="24"/>
+        </w:rPr>
+      </w:pPr>
+      <w:r>
+        <w:rPr>
+          <w:rFonts w:hint="cs"/>
+          <w:sz w:val="24"/>
+          <w:szCs w:val="24"/>
+          <w:cs/>
+        </w:rPr>
+        <w:t>त्यस</w:t>
+      </w:r>
+      <w:r>
+        <w:rPr>
+          <w:sz w:val="24"/>
+          <w:szCs w:val="24"/>
+          <w:cs/>
+        </w:rPr>
+        <w:t xml:space="preserve"> पछि देखिने बक्समा बन्द गर्नु पर्ने </w:t>
+      </w:r>
+      <w:r>
+        <w:rPr>
+          <w:rFonts w:hint="cs"/>
+          <w:sz w:val="24"/>
+          <w:szCs w:val="24"/>
+          <w:cs/>
+        </w:rPr>
+        <w:t>आर्थिक</w:t>
+      </w:r>
+      <w:r>
+        <w:rPr>
+          <w:sz w:val="24"/>
+          <w:szCs w:val="24"/>
+          <w:cs/>
+        </w:rPr>
+        <w:t xml:space="preserve"> वर्ष छान्ने र </w:t>
+      </w:r>
+      <w:r>
+        <w:rPr>
+          <w:rFonts w:hint="cs"/>
+          <w:sz w:val="24"/>
+          <w:szCs w:val="24"/>
+          <w:cs/>
+        </w:rPr>
+        <w:t>सेभ</w:t>
+      </w:r>
+      <w:r>
+        <w:rPr>
+          <w:sz w:val="24"/>
+          <w:szCs w:val="24"/>
+          <w:cs/>
+        </w:rPr>
+        <w:t xml:space="preserve"> गर्ने </w:t>
+      </w:r>
+      <w:r>
+        <w:rPr>
+          <w:rFonts w:hint="cs"/>
+          <w:sz w:val="24"/>
+          <w:szCs w:val="24"/>
+          <w:cs/>
+        </w:rPr>
+        <w:t>लेखिएको</w:t>
+      </w:r>
+      <w:r>
+        <w:rPr>
+          <w:sz w:val="24"/>
+          <w:szCs w:val="24"/>
+          <w:cs/>
+        </w:rPr>
+        <w:t xml:space="preserve"> बटन थिच्ने </w:t>
+      </w:r>
+    </w:p>
+    <w:p>
+      <w:pPr>
+        <w:pStyle w:val="ListParagraph"/>
+        <w:numPr>
+          <w:ilvl w:val="0"/>
+          <w:numId w:val="17"/>
+        </w:numPr>
+        <w:jc w:val="both"/>
+        <w:rPr>
+          <w:sz w:val="24"/>
+          <w:szCs w:val="24"/>
+        </w:rPr>
+      </w:pPr>
+      <w:r>
+        <w:rPr>
+          <w:rFonts w:hint="cs"/>
+          <w:sz w:val="24"/>
+          <w:szCs w:val="24"/>
+          <w:cs/>
+        </w:rPr>
+        <w:t>अव</w:t>
+      </w:r>
+      <w:r>
+        <w:rPr>
+          <w:sz w:val="24"/>
+          <w:szCs w:val="24"/>
+          <w:cs/>
+        </w:rPr>
+        <w:t xml:space="preserve"> अकाउन्ट स्वत लग आउट हुन्छ र </w:t>
+      </w:r>
+      <w:r>
+        <w:rPr>
+          <w:rFonts w:hint="cs"/>
+          <w:sz w:val="24"/>
+          <w:szCs w:val="24"/>
+          <w:cs/>
+        </w:rPr>
+        <w:t>आर्थिक</w:t>
+      </w:r>
+      <w:r>
+        <w:rPr>
+          <w:sz w:val="24"/>
+          <w:szCs w:val="24"/>
+          <w:cs/>
+        </w:rPr>
+        <w:t xml:space="preserve"> वर्ष बन्द गर्ने काम सुरु हुन्छ त्यस पछि कम्तिमा ५ मिनेट पछि लगिन गर्नुहोस् </w:t>
+      </w:r>
+      <w:r>
+        <w:rPr>
+          <w:rFonts w:hint="cs"/>
+          <w:sz w:val="24"/>
+          <w:szCs w:val="24"/>
+          <w:cs/>
+        </w:rPr>
+        <w:t>|</w:t>
+      </w:r>
+    </w:p>
+    <w:p>
+      <w:pPr>
+        <w:ind w:left="1080"/>
+        <w:jc w:val="both"/>
+        <w:rPr>
+          <w:rFonts w:hint="cs"/>
+          <w:sz w:val="24"/>
+          <w:szCs w:val="24"/>
+        </w:rPr>
+      </w:pPr>
+    </w:p>
+    <w:p>
+      <w:pPr>
+        <w:pStyle w:val="ListParagraph"/>
+        <w:numPr>
+          <w:ilvl w:val="0"/>
+          <w:numId w:val="2"/>
+        </w:numPr>
+        <w:jc w:val="both"/>
+        <w:rPr>
+          <w:sz w:val="24"/>
+          <w:szCs w:val="24"/>
+        </w:rPr>
+      </w:pPr>
+      <w:r>
+        <w:rPr>
+          <w:rFonts w:hint="cs"/>
+          <w:b/>
+          <w:bCs/>
+          <w:sz w:val="24"/>
+          <w:szCs w:val="24"/>
+          <w:cs/>
+        </w:rPr>
+        <w:t>आयोजना</w:t>
+      </w:r>
+      <w:r>
+        <w:rPr>
+          <w:b/>
+          <w:bCs/>
+          <w:sz w:val="24"/>
+          <w:szCs w:val="24"/>
+          <w:cs/>
+        </w:rPr>
+        <w:t xml:space="preserve"> अन्तर्गत</w:t>
+      </w:r>
+    </w:p>
+    <w:p>
+      <w:pPr>
+        <w:pStyle w:val="ListParagraph"/>
+        <w:jc w:val="both"/>
+        <w:rPr>
+          <w:rFonts w:hint="cs"/>
+          <w:sz w:val="24"/>
+          <w:szCs w:val="24"/>
+        </w:rPr>
+      </w:pPr>
+      <w:r>
+        <w:rPr>
+          <w:rFonts w:hint="cs"/>
+          <w:sz w:val="24"/>
+          <w:szCs w:val="24"/>
+          <w:cs/>
+        </w:rPr>
+        <w:t>आयोजना</w:t>
+      </w:r>
+      <w:r>
+        <w:rPr>
+          <w:sz w:val="24"/>
+          <w:szCs w:val="24"/>
+          <w:cs/>
+        </w:rPr>
+        <w:t xml:space="preserve"> संचालन गरी आयोजनाका सामाग्री समेत व्यवस्था गर्नुपर्ने कार्यालयले </w:t>
+      </w:r>
+      <w:r>
+        <w:rPr>
+          <w:rFonts w:hint="cs"/>
+          <w:sz w:val="24"/>
+          <w:szCs w:val="24"/>
+          <w:cs/>
+        </w:rPr>
+        <w:t>माथि</w:t>
+      </w:r>
+      <w:r>
+        <w:rPr>
+          <w:sz w:val="24"/>
+          <w:szCs w:val="24"/>
+          <w:cs/>
+        </w:rPr>
+        <w:t xml:space="preserve"> मुख्य मनुको </w:t>
+      </w:r>
+      <w:r>
+        <w:rPr>
+          <w:rFonts w:hint="cs"/>
+          <w:sz w:val="24"/>
+          <w:szCs w:val="24"/>
+          <w:cs/>
+        </w:rPr>
+        <w:t>बायाँ</w:t>
+      </w:r>
+      <w:r>
+        <w:rPr>
+          <w:sz w:val="24"/>
+          <w:szCs w:val="24"/>
+          <w:cs/>
+        </w:rPr>
+        <w:t xml:space="preserve"> पट्टि </w:t>
+      </w:r>
+      <w:r>
+        <w:rPr>
+          <w:rFonts w:hint="cs"/>
+          <w:sz w:val="24"/>
+          <w:szCs w:val="24"/>
+          <w:cs/>
+        </w:rPr>
+        <w:t>रहेको</w:t>
+      </w:r>
+      <w:r>
+        <w:rPr>
+          <w:sz w:val="24"/>
+          <w:szCs w:val="24"/>
+          <w:cs/>
+        </w:rPr>
         <w:t xml:space="preserve"> </w:t>
       </w:r>
       <w:r>
         <w:rPr>
+          <w:sz w:val="24"/>
+          <w:szCs w:val="24"/>
+        </w:rPr>
+        <w:t xml:space="preserve">SIMS office </w:t>
+      </w:r>
+      <w:r>
+        <w:rPr>
+          <w:rFonts w:hint="cs"/>
+          <w:sz w:val="24"/>
+          <w:szCs w:val="24"/>
+          <w:cs/>
+        </w:rPr>
+        <w:t>लेखिएको</w:t>
+      </w:r>
+      <w:r>
+        <w:rPr>
+          <w:sz w:val="24"/>
+          <w:szCs w:val="24"/>
+          <w:cs/>
+        </w:rPr>
+        <w:t xml:space="preserve"> लोगोमा क्लिक गरी </w:t>
+      </w:r>
+      <w:r>
+        <w:rPr>
+          <w:rFonts w:hint="cs"/>
+          <w:sz w:val="24"/>
+          <w:szCs w:val="24"/>
+          <w:cs/>
+        </w:rPr>
+        <w:t>आयोजना</w:t>
+      </w:r>
+      <w:r>
+        <w:rPr>
+          <w:sz w:val="24"/>
+          <w:szCs w:val="24"/>
+          <w:cs/>
+        </w:rPr>
+        <w:t xml:space="preserve"> तर्फको स्टोर</w:t>
+      </w:r>
+      <w:r>
+        <w:rPr>
+          <w:rFonts w:hint="cs"/>
+          <w:sz w:val="24"/>
+          <w:szCs w:val="24"/>
+          <w:cs/>
+        </w:rPr>
+        <w:t>मा</w:t>
+      </w:r>
+      <w:r>
+        <w:rPr>
+          <w:sz w:val="24"/>
+          <w:szCs w:val="24"/>
+          <w:cs/>
+        </w:rPr>
+        <w:t xml:space="preserve"> जान सक्ने छन् | </w:t>
+      </w:r>
+      <w:r>
+        <w:rPr>
+          <w:rFonts w:hint="cs"/>
+          <w:sz w:val="24"/>
+          <w:szCs w:val="24"/>
+          <w:cs/>
+        </w:rPr>
+        <w:t>अफिस</w:t>
+      </w:r>
+      <w:r>
+        <w:rPr>
+          <w:sz w:val="24"/>
+          <w:szCs w:val="24"/>
+          <w:cs/>
+        </w:rPr>
+        <w:t xml:space="preserve"> र आयोजनालाई छुट्टा छुट्टै रङ</w:t>
+      </w:r>
+      <w:r>
+        <w:rPr>
+          <w:rFonts w:hint="cs"/>
+          <w:sz w:val="24"/>
+          <w:szCs w:val="24"/>
+          <w:cs/>
+        </w:rPr>
+        <w:t xml:space="preserve"> दिएको</w:t>
+      </w:r>
+      <w:r>
+        <w:rPr>
+          <w:sz w:val="24"/>
+          <w:szCs w:val="24"/>
+          <w:cs/>
+        </w:rPr>
+        <w:t xml:space="preserve"> छ </w:t>
+      </w:r>
+      <w:r>
+        <w:rPr>
+          <w:rFonts w:hint="cs"/>
+          <w:sz w:val="24"/>
+          <w:szCs w:val="24"/>
+          <w:cs/>
+        </w:rPr>
+        <w:t>| अफिसमा</w:t>
+      </w:r>
+      <w:r>
+        <w:rPr>
+          <w:sz w:val="24"/>
+          <w:szCs w:val="24"/>
+          <w:cs/>
+        </w:rPr>
+        <w:t xml:space="preserve"> हुँदा निलो र आयोजनामा हुँदा हरियो मुख्य मेनु देखिन्छ </w:t>
+      </w:r>
+      <w:r>
+        <w:rPr>
+          <w:rFonts w:hint="cs"/>
+          <w:sz w:val="24"/>
+          <w:szCs w:val="24"/>
+          <w:cs/>
+        </w:rPr>
+        <w:t>| त्यसले</w:t>
+      </w:r>
+      <w:r>
+        <w:rPr>
+          <w:sz w:val="24"/>
+          <w:szCs w:val="24"/>
+          <w:cs/>
+        </w:rPr>
+        <w:t xml:space="preserve"> गर्दा अहिले कुन विवरणमा काम गरिरहेको छु </w:t>
+      </w:r>
+      <w:r>
+        <w:rPr>
+          <w:rFonts w:hint="cs"/>
+          <w:sz w:val="24"/>
+          <w:szCs w:val="24"/>
+          <w:cs/>
+        </w:rPr>
+        <w:t>भनि</w:t>
+      </w:r>
+      <w:r>
+        <w:rPr>
+          <w:sz w:val="24"/>
+          <w:szCs w:val="24"/>
+          <w:cs/>
+        </w:rPr>
+        <w:t xml:space="preserve"> छुट्टाउन</w:t>
+      </w:r>
+      <w:r>
+        <w:rPr>
+          <w:rFonts w:hint="cs"/>
+          <w:sz w:val="24"/>
+          <w:szCs w:val="24"/>
+          <w:cs/>
+        </w:rPr>
+        <w:t xml:space="preserve"> सजिलो</w:t>
+      </w:r>
+      <w:r>
+        <w:rPr>
+          <w:sz w:val="24"/>
+          <w:szCs w:val="24"/>
+          <w:cs/>
+        </w:rPr>
+        <w:t xml:space="preserve"> हुन्छ </w:t>
+      </w:r>
+      <w:r>
+        <w:rPr>
+          <w:rFonts w:hint="cs"/>
+          <w:sz w:val="24"/>
+          <w:szCs w:val="24"/>
+          <w:cs/>
+        </w:rPr>
+        <w:t>|</w:t>
+      </w:r>
+    </w:p>
+    <w:p>
+      <w:pPr>
+        <w:pStyle w:val="ListParagraph"/>
+        <w:jc w:val="both"/>
+        <w:rPr>
+          <w:sz w:val="24"/>
+          <w:szCs w:val="24"/>
+        </w:rPr>
+      </w:pPr>
+    </w:p>
+    <w:p>
+      <w:pPr>
+        <w:pStyle w:val="ListParagraph"/>
+        <w:jc w:val="both"/>
+        <w:rPr>
+          <w:rFonts w:hint="cs"/>
+          <w:sz w:val="24"/>
+          <w:szCs w:val="24"/>
+        </w:rPr>
+      </w:pPr>
+      <w:r>
+        <w:rPr>
+          <w:rFonts w:hint="cs"/>
+          <w:sz w:val="24"/>
+          <w:szCs w:val="24"/>
+          <w:cs/>
+        </w:rPr>
+        <w:t>आयोजना</w:t>
+      </w:r>
+      <w:r>
+        <w:rPr>
+          <w:sz w:val="24"/>
+          <w:szCs w:val="24"/>
+          <w:cs/>
+        </w:rPr>
+        <w:t xml:space="preserve"> संचालन नगर्ने कार्यालयले आयोजनाको </w:t>
+      </w:r>
+      <w:r>
+        <w:rPr>
+          <w:rFonts w:hint="cs"/>
+          <w:sz w:val="24"/>
+          <w:szCs w:val="24"/>
+          <w:cs/>
+        </w:rPr>
+        <w:t>स्टोर</w:t>
+      </w:r>
+      <w:r>
+        <w:rPr>
+          <w:sz w:val="24"/>
+          <w:szCs w:val="24"/>
+          <w:cs/>
+        </w:rPr>
+        <w:t xml:space="preserve"> देख्न सक्दैनन् </w:t>
+      </w:r>
+      <w:r>
+        <w:rPr>
+          <w:rFonts w:hint="cs"/>
+          <w:sz w:val="24"/>
+          <w:szCs w:val="24"/>
+          <w:cs/>
+        </w:rPr>
+        <w:t>|</w:t>
+      </w:r>
+    </w:p>
+    <w:p>
+      <w:pPr>
+        <w:pStyle w:val="ListParagraph"/>
+        <w:jc w:val="both"/>
+        <w:rPr>
+          <w:sz w:val="24"/>
+          <w:szCs w:val="24"/>
+        </w:rPr>
+      </w:pPr>
+    </w:p>
+    <w:p>
+      <w:pPr>
+        <w:pStyle w:val="ListParagraph"/>
+        <w:jc w:val="both"/>
+        <w:rPr>
+          <w:sz w:val="24"/>
+          <w:szCs w:val="24"/>
+        </w:rPr>
+      </w:pPr>
+      <w:r>
+        <w:rPr>
+          <w:rFonts w:hint="cs"/>
+          <w:sz w:val="24"/>
+          <w:szCs w:val="24"/>
+          <w:cs/>
+        </w:rPr>
+        <w:t>आयोजना</w:t>
+      </w:r>
+      <w:r>
+        <w:rPr>
+          <w:sz w:val="24"/>
+          <w:szCs w:val="24"/>
+          <w:cs/>
+        </w:rPr>
+        <w:t xml:space="preserve"> तर्फका सम्पूर्ण सेटिङ्गहरू जस्तै </w:t>
+      </w:r>
+      <w:r>
+        <w:rPr>
+          <w:rFonts w:hint="cs"/>
+          <w:sz w:val="24"/>
+          <w:szCs w:val="24"/>
+          <w:cs/>
+        </w:rPr>
+        <w:t>कार्यालय</w:t>
+      </w:r>
+      <w:r>
+        <w:rPr>
+          <w:sz w:val="24"/>
+          <w:szCs w:val="24"/>
+          <w:cs/>
+        </w:rPr>
+        <w:t>,</w:t>
+      </w:r>
+      <w:r>
+        <w:rPr>
+          <w:rFonts w:hint="cs"/>
+          <w:sz w:val="24"/>
+          <w:szCs w:val="24"/>
+          <w:cs/>
+        </w:rPr>
+        <w:t xml:space="preserve"> आ</w:t>
+      </w:r>
+      <w:r>
+        <w:rPr>
+          <w:sz w:val="24"/>
+          <w:szCs w:val="24"/>
+          <w:cs/>
+        </w:rPr>
+        <w:t>.</w:t>
+      </w:r>
+      <w:r>
+        <w:rPr>
+          <w:rFonts w:hint="cs"/>
+          <w:sz w:val="24"/>
+          <w:szCs w:val="24"/>
+          <w:cs/>
+        </w:rPr>
+        <w:t>व</w:t>
+      </w:r>
+      <w:r>
+        <w:rPr>
+          <w:sz w:val="24"/>
+          <w:szCs w:val="24"/>
+          <w:cs/>
+        </w:rPr>
+        <w:t>.</w:t>
+      </w:r>
+      <w:r>
+        <w:rPr>
+          <w:rFonts w:hint="cs"/>
+          <w:sz w:val="24"/>
+          <w:szCs w:val="24"/>
+          <w:cs/>
+        </w:rPr>
+        <w:t>, सक्रिय</w:t>
+      </w:r>
+      <w:r>
+        <w:rPr>
+          <w:sz w:val="24"/>
+          <w:szCs w:val="24"/>
+          <w:cs/>
+        </w:rPr>
+        <w:t xml:space="preserve"> </w:t>
+      </w:r>
+      <w:r>
+        <w:rPr>
+          <w:rFonts w:hint="cs"/>
+          <w:sz w:val="24"/>
+          <w:szCs w:val="24"/>
+          <w:cs/>
+        </w:rPr>
+        <w:t>आ</w:t>
+      </w:r>
+      <w:r>
+        <w:rPr>
+          <w:sz w:val="24"/>
+          <w:szCs w:val="24"/>
+          <w:cs/>
+        </w:rPr>
+        <w:t>.व.</w:t>
+      </w:r>
+      <w:r>
+        <w:rPr>
+          <w:rFonts w:hint="cs"/>
+          <w:sz w:val="24"/>
+          <w:szCs w:val="24"/>
+          <w:cs/>
+        </w:rPr>
+        <w:t>, नियन्त्रण</w:t>
+      </w:r>
+      <w:r>
+        <w:rPr>
+          <w:sz w:val="24"/>
+          <w:szCs w:val="24"/>
+          <w:cs/>
+        </w:rPr>
+        <w:t xml:space="preserve"> संयन्त्र,</w:t>
+      </w:r>
+      <w:r>
+        <w:rPr>
+          <w:rFonts w:hint="cs"/>
+          <w:sz w:val="24"/>
+          <w:szCs w:val="24"/>
+          <w:cs/>
+        </w:rPr>
+        <w:t xml:space="preserve"> जिन्सी</w:t>
+      </w:r>
+      <w:r>
+        <w:rPr>
+          <w:sz w:val="24"/>
+          <w:szCs w:val="24"/>
+          <w:cs/>
+        </w:rPr>
+        <w:t xml:space="preserve"> निरीक्षण समिति लगायत</w:t>
+      </w:r>
+      <w:r>
+        <w:rPr>
+          <w:rFonts w:hint="cs"/>
+          <w:sz w:val="24"/>
+          <w:szCs w:val="24"/>
+          <w:cs/>
+        </w:rPr>
+        <w:t>का</w:t>
+      </w:r>
+      <w:r>
+        <w:rPr>
+          <w:sz w:val="24"/>
+          <w:szCs w:val="24"/>
+          <w:cs/>
+        </w:rPr>
+        <w:t xml:space="preserve"> विवरण अफिस</w:t>
+      </w:r>
+      <w:r>
+        <w:rPr>
+          <w:rFonts w:hint="cs"/>
+          <w:sz w:val="24"/>
+          <w:szCs w:val="24"/>
+          <w:cs/>
+        </w:rPr>
+        <w:t>को</w:t>
+      </w:r>
+      <w:r>
+        <w:rPr>
+          <w:sz w:val="24"/>
+          <w:szCs w:val="24"/>
+          <w:cs/>
+        </w:rPr>
+        <w:t xml:space="preserve"> सेटिङ्ग</w:t>
+      </w:r>
+      <w:r>
+        <w:rPr>
+          <w:rFonts w:hint="cs"/>
+          <w:sz w:val="24"/>
+          <w:szCs w:val="24"/>
+          <w:cs/>
+        </w:rPr>
+        <w:t>बाट</w:t>
+      </w:r>
+      <w:r>
+        <w:rPr>
+          <w:sz w:val="24"/>
+          <w:szCs w:val="24"/>
+          <w:cs/>
+        </w:rPr>
+        <w:t xml:space="preserve"> नै लिईन्छ </w:t>
+      </w:r>
+      <w:r>
+        <w:rPr>
+          <w:rFonts w:hint="cs"/>
+          <w:sz w:val="24"/>
+          <w:szCs w:val="24"/>
+          <w:cs/>
+        </w:rPr>
+        <w:t>|</w:t>
+      </w:r>
+    </w:p>
+    <w:p>
+      <w:pPr>
+        <w:pStyle w:val="ListParagraph"/>
+        <w:jc w:val="both"/>
+        <w:rPr>
+          <w:sz w:val="24"/>
+          <w:szCs w:val="24"/>
+        </w:rPr>
+      </w:pPr>
+    </w:p>
+    <w:p>
+      <w:pPr>
+        <w:pStyle w:val="ListParagraph"/>
+        <w:jc w:val="both"/>
+        <w:rPr>
+          <w:rFonts w:hint="cs"/>
+          <w:b/>
+          <w:bCs/>
+          <w:color w:val="0070C0"/>
+          <w:sz w:val="24"/>
+          <w:szCs w:val="24"/>
+          <w:cs/>
+        </w:rPr>
+      </w:pPr>
+      <w:r>
+        <w:rPr>
+          <w:rFonts w:hint="cs"/>
+          <w:b/>
+          <w:bCs/>
+          <w:color w:val="0070C0"/>
+          <w:sz w:val="24"/>
+          <w:szCs w:val="24"/>
+          <w:cs/>
+        </w:rPr>
+        <w:t>आयोजना</w:t>
+      </w:r>
+      <w:r>
+        <w:rPr>
+          <w:b/>
+          <w:bCs/>
+          <w:color w:val="0070C0"/>
+          <w:sz w:val="24"/>
+          <w:szCs w:val="24"/>
+          <w:cs/>
+        </w:rPr>
+        <w:t xml:space="preserve"> र अफिस तर्फको सम्पूर्ण काम</w:t>
+      </w:r>
+      <w:r>
+        <w:rPr>
+          <w:rFonts w:hint="cs"/>
+          <w:b/>
+          <w:bCs/>
+          <w:color w:val="0070C0"/>
+          <w:sz w:val="24"/>
+          <w:szCs w:val="24"/>
+          <w:cs/>
+        </w:rPr>
+        <w:t xml:space="preserve"> उस्तै</w:t>
+      </w:r>
+      <w:r>
+        <w:rPr>
+          <w:b/>
+          <w:bCs/>
+          <w:color w:val="0070C0"/>
+          <w:sz w:val="24"/>
+          <w:szCs w:val="24"/>
+          <w:cs/>
+        </w:rPr>
+        <w:t xml:space="preserve"> भएकोले यहि म्यानुअल अनुसार गर्न सकिन्छ</w:t>
+      </w:r>
+      <w:r>
+        <w:rPr>
+          <w:rFonts w:hint="cs"/>
+          <w:b/>
+          <w:bCs/>
+          <w:color w:val="0070C0"/>
+          <w:sz w:val="24"/>
+          <w:szCs w:val="24"/>
+          <w:cs/>
+        </w:rPr>
+        <w:t xml:space="preserve"> |</w:t>
+      </w:r>
+      <w:r>
+        <w:rPr>
+          <w:b/>
+          <w:bCs/>
+          <w:color w:val="0070C0"/>
+          <w:sz w:val="24"/>
+          <w:szCs w:val="24"/>
+          <w:cs/>
+        </w:rPr>
+        <w:t xml:space="preserve"> </w:t>
+      </w:r>
+    </w:p>
+    <w:p>
+      <w:pPr>
+        <w:pStyle w:val="ListParagraph"/>
+        <w:ind w:left="1440"/>
+        <w:jc w:val="both"/>
+        <w:rPr>
+          <w:sz w:val="24"/>
+          <w:szCs w:val="24"/>
+        </w:rPr>
+      </w:pPr>
+    </w:p>
+    <w:p>
+      <w:pPr>
+        <w:pStyle w:val="ListParagraph"/>
+        <w:ind w:left="1440"/>
+        <w:jc w:val="both"/>
+        <w:rPr>
+          <w:sz w:val="24"/>
+          <w:szCs w:val="24"/>
+        </w:rPr>
+      </w:pPr>
+    </w:p>
+    <w:p>
+      <w:pPr>
+        <w:pStyle w:val="ListParagraph"/>
+        <w:numPr>
+          <w:ilvl w:val="0"/>
+          <w:numId w:val="2"/>
+        </w:numPr>
+        <w:jc w:val="both"/>
+        <w:rPr>
+          <w:b/>
+          <w:bCs/>
+          <w:sz w:val="24"/>
+          <w:szCs w:val="24"/>
+        </w:rPr>
+      </w:pPr>
+      <w:r>
+        <w:rPr>
+          <w:rFonts w:hint="cs"/>
+          <w:sz w:val="24"/>
+          <w:szCs w:val="24"/>
+          <w:cs/>
+        </w:rPr>
+        <w:t xml:space="preserve"> </w:t>
+      </w:r>
+      <w:r>
+        <w:rPr>
           <w:rFonts w:hint="cs"/>
           <w:b/>
           <w:bCs/>
@@ -15887,7 +16953,6 @@
         <w:pStyle w:val="ListParagraph"/>
         <w:jc w:val="both"/>
         <w:rPr>
-          <w:rFonts w:hint="cs"/>
           <w:sz w:val="24"/>
           <w:szCs w:val="24"/>
         </w:rPr>
@@ -17169,6 +18234,119 @@
     </w:lvl>
   </w:abstractNum>
   <w:abstractNum w:abstractNumId="10" w15:restartNumberingAfterBreak="0">
+    <w:nsid w:val="319C7400"/>
+    <w:multiLevelType w:val="hybridMultilevel"/>
+    <w:tmpl w:val="E2C09614"/>
+    <w:lvl w:ilvl="0" w:tplc="04090001">
+      <w:start w:val="1"/>
+      <w:numFmt w:val="bullet"/>
+      <w:lvlText w:val=""/>
+      <w:lvlJc w:val="left"/>
+      <w:pPr>
+        <w:ind w:left="1440" w:hanging="360"/>
+      </w:pPr>
+      <w:rPr>
+        <w:rFonts w:ascii="Symbol" w:hAnsi="Symbol" w:hint="default"/>
+      </w:rPr>
+    </w:lvl>
+    <w:lvl w:ilvl="1" w:tplc="04090003" w:tentative="1">
+      <w:start w:val="1"/>
+      <w:numFmt w:val="bullet"/>
+      <w:lvlText w:val="o"/>
+      <w:lvlJc w:val="left"/>
+      <w:pPr>
+        <w:ind w:left="2160" w:hanging="360"/>
+      </w:pPr>
+      <w:rPr>
+        <w:rFonts w:ascii="Courier New" w:hAnsi="Courier New" w:cs="Courier New" w:hint="default"/>
+      </w:rPr>
+    </w:lvl>
+    <w:lvl w:ilvl="2" w:tplc="04090005" w:tentative="1">
+      <w:start w:val="1"/>
+      <w:numFmt w:val="bullet"/>
+      <w:lvlText w:val=""/>
+      <w:lvlJc w:val="left"/>
+      <w:pPr>
+        <w:ind w:left="2880" w:hanging="360"/>
+      </w:pPr>
+      <w:rPr>
+        <w:rFonts w:ascii="Wingdings" w:hAnsi="Wingdings" w:hint="default"/>
+      </w:rPr>
+    </w:lvl>
+    <w:lvl w:ilvl="3" w:tplc="04090001" w:tentative="1">
+      <w:start w:val="1"/>
+      <w:numFmt w:val="bullet"/>
+      <w:lvlText w:val=""/>
+      <w:lvlJc w:val="left"/>
+      <w:pPr>
+        <w:ind w:left="3600" w:hanging="360"/>
+      </w:pPr>
+      <w:rPr>
+        <w:rFonts w:ascii="Symbol" w:hAnsi="Symbol" w:hint="default"/>
+      </w:rPr>
+    </w:lvl>
+    <w:lvl w:ilvl="4" w:tplc="04090003" w:tentative="1">
+      <w:start w:val="1"/>
+      <w:numFmt w:val="bullet"/>
+      <w:lvlText w:val="o"/>
+      <w:lvlJc w:val="left"/>
+      <w:pPr>
+        <w:ind w:left="4320" w:hanging="360"/>
+      </w:pPr>
+      <w:rPr>
+        <w:rFonts w:ascii="Courier New" w:hAnsi="Courier New" w:cs="Courier New" w:hint="default"/>
+      </w:rPr>
+    </w:lvl>
+    <w:lvl w:ilvl="5" w:tplc="04090005" w:tentative="1">
+      <w:start w:val="1"/>
+      <w:numFmt w:val="bullet"/>
+      <w:lvlText w:val=""/>
+      <w:lvlJc w:val="left"/>
+      <w:pPr>
+        <w:ind w:left="5040" w:hanging="360"/>
+      </w:pPr>
+      <w:rPr>
+        <w:rFonts w:ascii="Wingdings" w:hAnsi="Wingdings" w:hint="default"/>
+      </w:rPr>
+    </w:lvl>
+    <w:lvl w:ilvl="6" w:tplc="04090001" w:tentative="1">
+      <w:start w:val="1"/>
+      <w:numFmt w:val="bullet"/>
+      <w:lvlText w:val=""/>
+      <w:lvlJc w:val="left"/>
+      <w:pPr>
+        <w:ind w:left="5760" w:hanging="360"/>
+      </w:pPr>
+      <w:rPr>
+        <w:rFonts w:ascii="Symbol" w:hAnsi="Symbol" w:hint="default"/>
+      </w:rPr>
+    </w:lvl>
+    <w:lvl w:ilvl="7" w:tplc="04090003" w:tentative="1">
+      <w:start w:val="1"/>
+      <w:numFmt w:val="bullet"/>
+      <w:lvlText w:val="o"/>
+      <w:lvlJc w:val="left"/>
+      <w:pPr>
+        <w:ind w:left="6480" w:hanging="360"/>
+      </w:pPr>
+      <w:rPr>
+        <w:rFonts w:ascii="Courier New" w:hAnsi="Courier New" w:cs="Courier New" w:hint="default"/>
+      </w:rPr>
+    </w:lvl>
+    <w:lvl w:ilvl="8" w:tplc="04090005" w:tentative="1">
+      <w:start w:val="1"/>
+      <w:numFmt w:val="bullet"/>
+      <w:lvlText w:val=""/>
+      <w:lvlJc w:val="left"/>
+      <w:pPr>
+        <w:ind w:left="7200" w:hanging="360"/>
+      </w:pPr>
+      <w:rPr>
+        <w:rFonts w:ascii="Wingdings" w:hAnsi="Wingdings" w:hint="default"/>
+      </w:rPr>
+    </w:lvl>
+  </w:abstractNum>
+  <w:abstractNum w:abstractNumId="11" w15:restartNumberingAfterBreak="0">
     <w:nsid w:val="32547B4B"/>
     <w:multiLevelType w:val="hybridMultilevel"/>
     <w:tmpl w:val="490E1B1E"/>
@@ -17257,7 +18435,7 @@
       </w:pPr>
     </w:lvl>
   </w:abstractNum>
-  <w:abstractNum w:abstractNumId="11" w15:restartNumberingAfterBreak="0">
+  <w:abstractNum w:abstractNumId="12" w15:restartNumberingAfterBreak="0">
     <w:nsid w:val="36AF0392"/>
     <w:multiLevelType w:val="hybridMultilevel"/>
     <w:tmpl w:val="4F641A9A"/>
@@ -17370,7 +18548,7 @@
       </w:rPr>
     </w:lvl>
   </w:abstractNum>
-  <w:abstractNum w:abstractNumId="12" w15:restartNumberingAfterBreak="0">
+  <w:abstractNum w:abstractNumId="13" w15:restartNumberingAfterBreak="0">
     <w:nsid w:val="4A5F5159"/>
     <w:multiLevelType w:val="hybridMultilevel"/>
     <w:tmpl w:val="64186466"/>
@@ -17483,7 +18661,7 @@
       </w:rPr>
     </w:lvl>
   </w:abstractNum>
-  <w:abstractNum w:abstractNumId="13" w15:restartNumberingAfterBreak="0">
+  <w:abstractNum w:abstractNumId="14" w15:restartNumberingAfterBreak="0">
     <w:nsid w:val="64667C19"/>
     <w:multiLevelType w:val="hybridMultilevel"/>
     <w:tmpl w:val="480A3FDA"/>
@@ -17596,7 +18774,7 @@
       </w:rPr>
     </w:lvl>
   </w:abstractNum>
-  <w:abstractNum w:abstractNumId="14" w15:restartNumberingAfterBreak="0">
+  <w:abstractNum w:abstractNumId="15" w15:restartNumberingAfterBreak="0">
     <w:nsid w:val="757F4D81"/>
     <w:multiLevelType w:val="hybridMultilevel"/>
     <w:tmpl w:val="01F8D470"/>
@@ -17709,7 +18887,7 @@
       </w:rPr>
     </w:lvl>
   </w:abstractNum>
-  <w:abstractNum w:abstractNumId="15" w15:restartNumberingAfterBreak="0">
+  <w:abstractNum w:abstractNumId="16" w15:restartNumberingAfterBreak="0">
     <w:nsid w:val="7C3F44D4"/>
     <w:multiLevelType w:val="hybridMultilevel"/>
     <w:tmpl w:val="5718B048"/>
@@ -17826,7 +19004,7 @@
     <w:abstractNumId w:val="4"/>
   </w:num>
   <w:num w:numId="2">
-    <w:abstractNumId w:val="10"/>
+    <w:abstractNumId w:val="11"/>
   </w:num>
   <w:num w:numId="3">
     <w:abstractNumId w:val="0"/>
@@ -17841,7 +19019,7 @@
     <w:abstractNumId w:val="8"/>
   </w:num>
   <w:num w:numId="7">
-    <w:abstractNumId w:val="14"/>
+    <w:abstractNumId w:val="15"/>
   </w:num>
   <w:num w:numId="8">
     <w:abstractNumId w:val="7"/>
@@ -17850,7 +19028,7 @@
     <w:abstractNumId w:val="9"/>
   </w:num>
   <w:num w:numId="10">
-    <w:abstractNumId w:val="15"/>
+    <w:abstractNumId w:val="16"/>
   </w:num>
   <w:num w:numId="11">
     <w:abstractNumId w:val="1"/>
@@ -17859,16 +19037,19 @@
     <w:abstractNumId w:val="2"/>
   </w:num>
   <w:num w:numId="13">
-    <w:abstractNumId w:val="11"/>
+    <w:abstractNumId w:val="12"/>
   </w:num>
   <w:num w:numId="14">
-    <w:abstractNumId w:val="12"/>
+    <w:abstractNumId w:val="13"/>
   </w:num>
   <w:num w:numId="15">
     <w:abstractNumId w:val="5"/>
   </w:num>
   <w:num w:numId="16">
-    <w:abstractNumId w:val="13"/>
+    <w:abstractNumId w:val="14"/>
+  </w:num>
+  <w:num w:numId="17">
+    <w:abstractNumId w:val="10"/>
   </w:num>
 </w:numbering>
 </file>
@@ -18584,7 +19765,7 @@
 </file>
 
 <file path=customXml/itemProps1.xml><?xml version="1.0" encoding="utf-8"?>
-<ds:datastoreItem xmlns:ds="http://schemas.openxmlformats.org/officeDocument/2006/customXml" ds:itemID="{202AE5C1-59DE-47F3-8055-755685F49D3C}">
+<ds:datastoreItem xmlns:ds="http://schemas.openxmlformats.org/officeDocument/2006/customXml" ds:itemID="{D0DAF602-2903-435E-8104-0C2FCC51246E}">
   <ds:schemaRefs>
     <ds:schemaRef ds:uri="http://schemas.openxmlformats.org/officeDocument/2006/bibliography"/>
   </ds:schemaRefs>

</xml_diff>